<commit_message>
v10: unify "judgment" and call the supplementary files by that name
Four "judgement" become "judgment" (the other twelve occurrences already were);
"released files" in Section 3.3 becomes "supplementary files". No number changes.
Audit output refreshed (97 checks pass).

Co-Authored-By: Claude <noreply@anthropic.com>
Claude-Session: https://claude.ai/code/session_01SMspJ2iUSjtgJAMnLGppxV
</commit_message>
<xml_diff>
--- a/youwen/manuscript/submission/Manuscript_anonymised.docx
+++ b/youwen/manuscript/submission/Manuscript_anonymised.docx
@@ -3296,7 +3296,7 @@
         <w:t xml:space="preserve">瑁,</w:t>
       </w:r>
       <w:r>
-        <w:t xml:space="preserve"> is blank in the print). We treat a Dà Xú label as Xu Shen’s judgement unless the collation shows otherwise. This is the first of three bridging assumptions, and the 140 shared labels test it against the Song editors, though not against earlier transmission.</w:t>
+        <w:t xml:space="preserve"> is blank in the print). We treat a Dà Xú label as Xu Shen’s judgment unless the collation shows otherwise. This is the first of three bridging assumptions, and the 140 shared labels test it against the Song editors, though not against earlier transmission.</w:t>
       </w:r>
     </w:p>
     <w:bookmarkEnd w:id="25"/>
@@ -4574,7 +4574,7 @@
         <w:pStyle w:val="BodyText"/>
       </w:pPr>
       <w:r>
-        <w:t xml:space="preserve">Meaning was first coded on a random sample of 100 pairs (40 labelled, 60 ordinary) drawn from pairs with OC forms at both ends. A large language model (Claude, Anthropic) coded each pair twice: the instance that built the dataset, knowing the group, and then a separate instance that worked blind, seeing only the instructions and the stripped glosses and barred from files and the web (protocol in Online Resource 1). They agree on 86 of 100 pairs (Cohen’s κ = 0.773), with no Y–N disagreement. We analyse the blind pass; the non-blind pass gives the same contrast (Section 4.3). Both authors also coded the pairs independently and agreed with the blind pass throughout, but their working sheets were not kept, so this check cannot be reproduced from the released files. Six items were later excluded and 11 proper names set aside, leaving 83 for H2. The codes of this sample are in Online Resource 3.</w:t>
+        <w:t xml:space="preserve">Meaning was first coded on a random sample of 100 pairs (40 labelled, 60 ordinary) drawn from pairs with OC forms at both ends. A large language model (Claude, Anthropic) coded each pair twice: the instance that built the dataset, knowing the group, and then a separate instance that worked blind, seeing only the instructions and the stripped glosses and barred from files and the web (protocol in Online Resource 1). They agree on 86 of 100 pairs (Cohen’s κ = 0.773), with no Y–N disagreement. We analyse the blind pass; the non-blind pass gives the same contrast (Section 4.3). Both authors also coded the pairs independently and agreed with the blind pass throughout, but their working sheets were not kept, so this check cannot be reproduced from the supplementary files. Six items were later excluded and 11 proper names set aside, leaving 83 for H2. The codes of this sample are in Online Resource 3.</w:t>
       </w:r>
     </w:p>
     <w:bookmarkEnd w:id="27"/>
@@ -13858,7 +13858,7 @@
         <w:pStyle w:val="BodyText"/>
       </w:pPr>
       <w:r>
-        <w:t xml:space="preserve">This is, on a larger scale, the lesson Rasin et al. (2024) drew from Arad’s diagnostics (Section 2.4). It also fits paradigm-based definitions of relatedness, which require no designated base and no fixed direction (Bonami &amp; Strnadová, 2019; Hathout &amp; Namer, 2019): tested at the level of the population, the label, a native judgement of the content side, recovers the form relations that recur with that content, identity and the *-s alternation, and nothing about direction.</w:t>
+        <w:t xml:space="preserve">This is, on a larger scale, the lesson Rasin et al. (2024) drew from Arad’s diagnostics (Section 2.4). It also fits paradigm-based definitions of relatedness, which require no designated base and no fixed direction (Bonami &amp; Strnadová, 2019; Hathout &amp; Namer, 2019): tested at the level of the population, the label, a native judgment of the content side, recovers the form relations that recur with that content, identity and the *-s alternation, and nothing about direction.</w:t>
       </w:r>
     </w:p>
     <w:p>
@@ -13892,7 +13892,7 @@
         <w:pStyle w:val="FirstParagraph"/>
       </w:pPr>
       <w:r>
-        <w:t xml:space="preserve">The shared layer, the one most likely to go back to Xu Shen, is less often homophonous and more often remote than the Dà Xú-only layer (Table 10). If the Dà Xú-only labels are later additions, their authors may have applied Xu’s criterion more generously, so that the extra labels fell where related pairs are densest, on homophones; or they may have followed a narrower, sound-oriented criterion, labelling where the phonetic sounded the same and the gloss used it (34% of the Dà Xú-only labels, against 22% of the shared ones), while Xu’s own rest on the broader judgement that the phonetic contributes meaning, so that much of the phonological core would be a product of transmission. The</w:t>
+        <w:t xml:space="preserve">The shared layer, the one most likely to go back to Xu Shen, is less often homophonous and more often remote than the Dà Xú-only layer (Table 10). If the Dà Xú-only labels are later additions, their authors may have applied Xu’s criterion more generously, so that the extra labels fell where related pairs are densest, on homophones; or they may have followed a narrower, sound-oriented criterion, labelling where the phonetic sounded the same and the gloss used it (34% of the Dà Xú-only labels, against 22% of the shared ones), while Xu’s own rest on the broader judgment that the phonetic contributes meaning, so that much of the phonological core would be a product of transmission. The</w:t>
       </w:r>
       <w:r>
         <w:t xml:space="preserve"> </w:t>
@@ -14153,7 +14153,7 @@
         <w:pStyle w:val="FirstParagraph"/>
       </w:pPr>
       <w:r>
-        <w:t xml:space="preserve">Three bridging assumptions carry the argument: that the MC readings reflect the sound relations of Xu’s words, that his glosses reflect Han-period relations of meaning, and that the Dà Xú label is his judgement. The checks of Section 5.1 constrain each without proving it. The first is weakest where it matters most for H1c, since some tone-change readings are analogical creations of the reading tradition and MC does not always show which words had *-s (Baxter &amp; Sagart, 1998, 2014), although Jacques (2022) argues that the tradition as a whole preserves inherited morphology.</w:t>
+        <w:t xml:space="preserve">Three bridging assumptions carry the argument: that the MC readings reflect the sound relations of Xu’s words, that his glosses reflect Han-period relations of meaning, and that the Dà Xú label is his judgment. The checks of Section 5.1 constrain each without proving it. The first is weakest where it matters most for H1c, since some tone-change readings are analogical creations of the reading tradition and MC does not always show which words had *-s (Baxter &amp; Sagart, 1998, 2014), although Jacques (2022) argues that the tradition as a whole preserves inherited morphology.</w:t>
       </w:r>
     </w:p>
     <w:p>

</xml_diff>

<commit_message>
v10: abstract rewritten (200 words, no data) and keywords standardised, at Qu's request
The abstract states the problem, the object, the method, the findings and the conclusion without percentages or sample sizes
and does not open with a question; "Suffix *-s" leaves the keywords. Anonymised manuscript, title page, cover letter and Word
files rebuilt; audit 133 checks pass including the ESM_7 rerun. Text, tables, figure and supplement are unchanged.

Co-Authored-By: Claude <noreply@anthropic.com>
Claude-Session: https://claude.ai/code/session_01SMspJ2iUSjtgJAMnLGppxV
</commit_message>
<xml_diff>
--- a/youwen/manuscript/submission/Manuscript_anonymised.docx
+++ b/youwen/manuscript/submission/Manuscript_anonymised.docx
@@ -68,7 +68,7 @@
         <w:pStyle w:val="BodyText"/>
       </w:pPr>
       <w:r>
-        <w:t xml:space="preserve">How can derivation be identified where morphology is largely absent from the written record? We ask whether a native analyst’s classification can serve as evidence, and for which part of derivation. The</w:t>
+        <w:t xml:space="preserve">Where morphology is largely absent from the written record, derivation has to be inferred from evidence. Old Chinese is such a case: its affixes are reconstructed rather than observed, and its script writes whole syllables, so no affix is written on its own. This study asks whether a native analyst’s classification can serve as evidence, and for which part of derivation. It takes the</w:t>
       </w:r>
       <w:r>
         <w:t xml:space="preserve"> </w:t>
@@ -78,13 +78,25 @@
           <w:i/>
           <w:iCs/>
         </w:rPr>
-        <w:t xml:space="preserve">Shuōwén jiězì</w:t>
-      </w:r>
-      <w:r>
-        <w:t xml:space="preserve"> </w:t>
-      </w:r>
-      <w:r>
-        <w:t xml:space="preserve">(100 CE) analyses about two hundred characters as</w:t>
+        <w:t xml:space="preserve">yìshēng</w:t>
+      </w:r>
+      <w:r>
+        <w:t xml:space="preserve"> </w:t>
+      </w:r>
+      <w:r>
+        <w:rPr>
+          <w:rFonts w:hint="eastAsia"/>
+        </w:rPr>
+        <w:t xml:space="preserve">亦聲</w:t>
+      </w:r>
+      <w:r>
+        <w:t xml:space="preserve"> (</w:t>
+      </w:r>
+      <w:r>
+        <w:t xml:space="preserve">“also phonetic”</w:t>
+      </w:r>
+      <w:r>
+        <w:t xml:space="preserve">) label of the</w:t>
       </w:r>
       <w:r>
         <w:t xml:space="preserve"> </w:t>
@@ -94,28 +106,13 @@
           <w:i/>
           <w:iCs/>
         </w:rPr>
-        <w:t xml:space="preserve">yìshēng</w:t>
-      </w:r>
-      <w:r>
-        <w:t xml:space="preserve"> </w:t>
-      </w:r>
-      <w:r>
-        <w:rPr>
-          <w:rFonts w:hint="eastAsia"/>
-        </w:rPr>
-        <w:t xml:space="preserve">亦聲,</w:t>
-      </w:r>
-      <w:r>
-        <w:t xml:space="preserve"> their meaningful component being</w:t>
-      </w:r>
-      <w:r>
-        <w:t xml:space="preserve"> </w:t>
-      </w:r>
-      <w:r>
-        <w:t xml:space="preserve">“also the phonetic”</w:t>
-      </w:r>
-      <w:r>
-        <w:t xml:space="preserve">. We compare all 212 labelled entries of the Dà Xú recension with the 953 ordinary phonetic compounds on the same 172 phonetics, using Middle Chinese readings, Old Chinese reconstructions and blind semantic coding of 767 pairs. Labelled characters are over twice as often homophonous with their phonetic (35.6% vs 15.5%) and enriched in departing-tone alternations, the reflex of the Old Chinese suffix *-s, but not in other alternations of tone or voicing. They are far more often related in meaning (82% vs 17%), but the label says nothing detectable about which member is derived. In a test specified before the enlarged coding, related labelled pairs are still more often homophonous or departing-tone alternants than related ordinary pairs (52% vs 29%), a difference that coded relatedness does not account for. The preference is moderate and, like the other sound effects, smaller and less precise in the labels most likely to be Xu Shen’s own, while the contrast in meaning is not. We argue that the label evidences lexical relatedness with a moderate preference for the same word or a minimal derivative, and that where morphology is covert, relatedness, formal relation and direction must be diagnosed separately.</w:t>
+        <w:t xml:space="preserve">Shuōwén jiězì</w:t>
+      </w:r>
+      <w:r>
+        <w:t xml:space="preserve"> </w:t>
+      </w:r>
+      <w:r>
+        <w:t xml:space="preserve">(100 CE), which marks compounds whose phonetic component also carries meaning. Labelled characters are compared with ordinary phonetic compounds on the same phonetics, using Middle Chinese readings, Old Chinese reconstructions and a blind semantic coding. The label tracks relatedness of meaning. Among related pairs it shows a moderate preference for the same word or a minimal derivative, notably pairs that differ only in the tone reflecting the suffix *-s. It says nothing detectable about which member is derived. The sound effects are weaker in the labels most likely to be Xu Shen’s own, whereas the contrast in meaning is not. It follows that a native classification evidences lexical relatedness and formal closeness, and that where morphology is covert, relatedness, formal relation and direction must be diagnosed separately.</w:t>
       </w:r>
     </w:p>
     <w:p>
@@ -133,7 +130,7 @@
         <w:t xml:space="preserve"> </w:t>
       </w:r>
       <w:r>
-        <w:t xml:space="preserve">Lexical relatedness · Derivation · Conversion · Old Chinese · Suffix *-s · Writing systems</w:t>
+        <w:t xml:space="preserve">Derivation · Lexical relatedness · Conversion · Phonetic compounds · Chinese writing system · Old Chinese</w:t>
       </w:r>
     </w:p>
     <w:bookmarkStart w:id="18" w:name="introduction"/>

</xml_diff>